<commit_message>
correcion en archivos nombre integrantes
</commit_message>
<xml_diff>
--- a/01_Plan_Maestro_Pruebas/Plan_Maestro_de_Pruebas_FoamWash.docx
+++ b/01_Plan_Maestro_Pruebas/Plan_Maestro_de_Pruebas_FoamWash.docx
@@ -116,7 +116,14 @@
           <w:sz w:val="20"/>
           <w:szCs w:val="20"/>
         </w:rPr>
-        <w:t>Michelle Alejandra Quintero Aragón</w:t>
+        <w:t>Michel</w:t>
+      </w:r>
+      <w:r>
+        <w:rPr>
+          <w:sz w:val="20"/>
+          <w:szCs w:val="20"/>
+        </w:rPr>
+        <w:t xml:space="preserve"> Alejandra Quintero Aragón</w:t>
       </w:r>
     </w:p>
     <w:p>
@@ -281,12 +288,6 @@
         <w:gridCol w:w="2140"/>
       </w:tblGrid>
       <w:tr>
-        <w:tblPrEx>
-          <w:tblCellMar>
-            <w:top w:w="0" w:type="dxa"/>
-            <w:bottom w:w="0" w:type="dxa"/>
-          </w:tblCellMar>
-        </w:tblPrEx>
         <w:trPr>
           <w:tblHeader/>
         </w:trPr>
@@ -404,12 +405,6 @@
         </w:tc>
       </w:tr>
       <w:tr>
-        <w:tblPrEx>
-          <w:tblCellMar>
-            <w:top w:w="0" w:type="dxa"/>
-            <w:bottom w:w="0" w:type="dxa"/>
-          </w:tblCellMar>
-        </w:tblPrEx>
         <w:tc>
           <w:tcPr>
             <w:tcW w:w="1600" w:type="dxa"/>
@@ -537,10 +532,7 @@
         <w:jc w:val="both"/>
       </w:pPr>
       <w:r>
-        <w:t>El presente Plan Maestro de Pruebas define la estrategia, el alcance, los recursos y el cronograma que orientan el proceso de verificación y validación del sistema de información del proyecto FoamWash, empresa dedicada al servicio de lavado de mobiliario, incluyendo sofás, colchones, sillas y muebles en general. Este documento establece los lineamientos bajo los cuales el equipo de aseguramiento de calidad (QA) del proyecto ejecuta las actividades de prueba sobre los veintidós (22) requisitos funcionales (R</w:t>
-      </w:r>
-      <w:r>
-        <w:t>F) y los diez (10) requisitos no funcionales (RNF) definidos en las etapas de análisis y diseño del sistema.</w:t>
+        <w:t>El presente Plan Maestro de Pruebas define la estrategia, el alcance, los recursos y el cronograma que orientan el proceso de verificación y validación del sistema de información del proyecto FoamWash, empresa dedicada al servicio de lavado de mobiliario, incluyendo sofás, colchones, sillas y muebles en general. Este documento establece los lineamientos bajo los cuales el equipo de aseguramiento de calidad (QA) del proyecto ejecuta las actividades de prueba sobre los veintidós (22) requisitos funcionales (RF) y los diez (10) requisitos no funcionales (RNF) definidos en las etapas de análisis y diseño del sistema.</w:t>
       </w:r>
     </w:p>
     <w:p>
@@ -1415,12 +1407,6 @@
         <w:gridCol w:w="4040"/>
       </w:tblGrid>
       <w:tr>
-        <w:tblPrEx>
-          <w:tblCellMar>
-            <w:top w:w="0" w:type="dxa"/>
-            <w:bottom w:w="0" w:type="dxa"/>
-          </w:tblCellMar>
-        </w:tblPrEx>
         <w:trPr>
           <w:tblHeader/>
         </w:trPr>
@@ -1510,12 +1496,6 @@
         </w:tc>
       </w:tr>
       <w:tr>
-        <w:tblPrEx>
-          <w:tblCellMar>
-            <w:top w:w="0" w:type="dxa"/>
-            <w:bottom w:w="0" w:type="dxa"/>
-          </w:tblCellMar>
-        </w:tblPrEx>
         <w:tc>
           <w:tcPr>
             <w:tcW w:w="2600" w:type="dxa"/>
@@ -1590,12 +1570,6 @@
         </w:tc>
       </w:tr>
       <w:tr>
-        <w:tblPrEx>
-          <w:tblCellMar>
-            <w:top w:w="0" w:type="dxa"/>
-            <w:bottom w:w="0" w:type="dxa"/>
-          </w:tblCellMar>
-        </w:tblPrEx>
         <w:tc>
           <w:tcPr>
             <w:tcW w:w="2600" w:type="dxa"/>
@@ -1670,12 +1644,6 @@
         </w:tc>
       </w:tr>
       <w:tr>
-        <w:tblPrEx>
-          <w:tblCellMar>
-            <w:top w:w="0" w:type="dxa"/>
-            <w:bottom w:w="0" w:type="dxa"/>
-          </w:tblCellMar>
-        </w:tblPrEx>
         <w:tc>
           <w:tcPr>
             <w:tcW w:w="2600" w:type="dxa"/>
@@ -1750,12 +1718,6 @@
         </w:tc>
       </w:tr>
       <w:tr>
-        <w:tblPrEx>
-          <w:tblCellMar>
-            <w:top w:w="0" w:type="dxa"/>
-            <w:bottom w:w="0" w:type="dxa"/>
-          </w:tblCellMar>
-        </w:tblPrEx>
         <w:tc>
           <w:tcPr>
             <w:tcW w:w="2600" w:type="dxa"/>
@@ -1801,7 +1763,15 @@
                 <w:sz w:val="20"/>
                 <w:szCs w:val="20"/>
               </w:rPr>
-              <w:t>Michelle Alejandra Quintero Aragón</w:t>
+              <w:t>Michel</w:t>
+            </w:r>
+            <w:r>
+              <w:rPr>
+                <w:color w:val="000000"/>
+                <w:sz w:val="20"/>
+                <w:szCs w:val="20"/>
+              </w:rPr>
+              <w:t xml:space="preserve"> Alejandra Quintero Aragón</w:t>
             </w:r>
           </w:p>
         </w:tc>
@@ -1830,12 +1800,6 @@
         </w:tc>
       </w:tr>
       <w:tr>
-        <w:tblPrEx>
-          <w:tblCellMar>
-            <w:top w:w="0" w:type="dxa"/>
-            <w:bottom w:w="0" w:type="dxa"/>
-          </w:tblCellMar>
-        </w:tblPrEx>
         <w:tc>
           <w:tcPr>
             <w:tcW w:w="2600" w:type="dxa"/>
@@ -1910,12 +1874,6 @@
         </w:tc>
       </w:tr>
       <w:tr>
-        <w:tblPrEx>
-          <w:tblCellMar>
-            <w:top w:w="0" w:type="dxa"/>
-            <w:bottom w:w="0" w:type="dxa"/>
-          </w:tblCellMar>
-        </w:tblPrEx>
         <w:tc>
           <w:tcPr>
             <w:tcW w:w="2600" w:type="dxa"/>
@@ -2055,12 +2013,6 @@
         <w:gridCol w:w="1240"/>
       </w:tblGrid>
       <w:tr>
-        <w:tblPrEx>
-          <w:tblCellMar>
-            <w:top w:w="0" w:type="dxa"/>
-            <w:bottom w:w="0" w:type="dxa"/>
-          </w:tblCellMar>
-        </w:tblPrEx>
         <w:trPr>
           <w:tblHeader/>
         </w:trPr>
@@ -2178,12 +2130,6 @@
         </w:tc>
       </w:tr>
       <w:tr>
-        <w:tblPrEx>
-          <w:tblCellMar>
-            <w:top w:w="0" w:type="dxa"/>
-            <w:bottom w:w="0" w:type="dxa"/>
-          </w:tblCellMar>
-        </w:tblPrEx>
         <w:tc>
           <w:tcPr>
             <w:tcW w:w="1200" w:type="dxa"/>
@@ -2281,12 +2227,6 @@
         </w:tc>
       </w:tr>
       <w:tr>
-        <w:tblPrEx>
-          <w:tblCellMar>
-            <w:top w:w="0" w:type="dxa"/>
-            <w:bottom w:w="0" w:type="dxa"/>
-          </w:tblCellMar>
-        </w:tblPrEx>
         <w:tc>
           <w:tcPr>
             <w:tcW w:w="1200" w:type="dxa"/>
@@ -2385,12 +2325,6 @@
         </w:tc>
       </w:tr>
       <w:tr>
-        <w:tblPrEx>
-          <w:tblCellMar>
-            <w:top w:w="0" w:type="dxa"/>
-            <w:bottom w:w="0" w:type="dxa"/>
-          </w:tblCellMar>
-        </w:tblPrEx>
         <w:tc>
           <w:tcPr>
             <w:tcW w:w="1200" w:type="dxa"/>
@@ -2488,12 +2422,6 @@
         </w:tc>
       </w:tr>
       <w:tr>
-        <w:tblPrEx>
-          <w:tblCellMar>
-            <w:top w:w="0" w:type="dxa"/>
-            <w:bottom w:w="0" w:type="dxa"/>
-          </w:tblCellMar>
-        </w:tblPrEx>
         <w:tc>
           <w:tcPr>
             <w:tcW w:w="1200" w:type="dxa"/>
@@ -2591,12 +2519,6 @@
         </w:tc>
       </w:tr>
       <w:tr>
-        <w:tblPrEx>
-          <w:tblCellMar>
-            <w:top w:w="0" w:type="dxa"/>
-            <w:bottom w:w="0" w:type="dxa"/>
-          </w:tblCellMar>
-        </w:tblPrEx>
         <w:tc>
           <w:tcPr>
             <w:tcW w:w="1200" w:type="dxa"/>
@@ -2694,12 +2616,6 @@
         </w:tc>
       </w:tr>
       <w:tr>
-        <w:tblPrEx>
-          <w:tblCellMar>
-            <w:top w:w="0" w:type="dxa"/>
-            <w:bottom w:w="0" w:type="dxa"/>
-          </w:tblCellMar>
-        </w:tblPrEx>
         <w:tc>
           <w:tcPr>
             <w:tcW w:w="1200" w:type="dxa"/>
@@ -2797,12 +2713,6 @@
         </w:tc>
       </w:tr>
       <w:tr>
-        <w:tblPrEx>
-          <w:tblCellMar>
-            <w:top w:w="0" w:type="dxa"/>
-            <w:bottom w:w="0" w:type="dxa"/>
-          </w:tblCellMar>
-        </w:tblPrEx>
         <w:tc>
           <w:tcPr>
             <w:tcW w:w="1200" w:type="dxa"/>
@@ -2900,12 +2810,6 @@
         </w:tc>
       </w:tr>
       <w:tr>
-        <w:tblPrEx>
-          <w:tblCellMar>
-            <w:top w:w="0" w:type="dxa"/>
-            <w:bottom w:w="0" w:type="dxa"/>
-          </w:tblCellMar>
-        </w:tblPrEx>
         <w:tc>
           <w:tcPr>
             <w:tcW w:w="1200" w:type="dxa"/>
@@ -3003,12 +2907,6 @@
         </w:tc>
       </w:tr>
       <w:tr>
-        <w:tblPrEx>
-          <w:tblCellMar>
-            <w:top w:w="0" w:type="dxa"/>
-            <w:bottom w:w="0" w:type="dxa"/>
-          </w:tblCellMar>
-        </w:tblPrEx>
         <w:tc>
           <w:tcPr>
             <w:tcW w:w="1200" w:type="dxa"/>
@@ -3106,12 +3004,6 @@
         </w:tc>
       </w:tr>
       <w:tr>
-        <w:tblPrEx>
-          <w:tblCellMar>
-            <w:top w:w="0" w:type="dxa"/>
-            <w:bottom w:w="0" w:type="dxa"/>
-          </w:tblCellMar>
-        </w:tblPrEx>
         <w:tc>
           <w:tcPr>
             <w:tcW w:w="1200" w:type="dxa"/>
@@ -3209,12 +3101,6 @@
         </w:tc>
       </w:tr>
       <w:tr>
-        <w:tblPrEx>
-          <w:tblCellMar>
-            <w:top w:w="0" w:type="dxa"/>
-            <w:bottom w:w="0" w:type="dxa"/>
-          </w:tblCellMar>
-        </w:tblPrEx>
         <w:tc>
           <w:tcPr>
             <w:tcW w:w="1200" w:type="dxa"/>
@@ -3312,12 +3198,6 @@
         </w:tc>
       </w:tr>
       <w:tr>
-        <w:tblPrEx>
-          <w:tblCellMar>
-            <w:top w:w="0" w:type="dxa"/>
-            <w:bottom w:w="0" w:type="dxa"/>
-          </w:tblCellMar>
-        </w:tblPrEx>
         <w:tc>
           <w:tcPr>
             <w:tcW w:w="1200" w:type="dxa"/>
@@ -3415,12 +3295,6 @@
         </w:tc>
       </w:tr>
       <w:tr>
-        <w:tblPrEx>
-          <w:tblCellMar>
-            <w:top w:w="0" w:type="dxa"/>
-            <w:bottom w:w="0" w:type="dxa"/>
-          </w:tblCellMar>
-        </w:tblPrEx>
         <w:tc>
           <w:tcPr>
             <w:tcW w:w="1200" w:type="dxa"/>
@@ -3518,12 +3392,6 @@
         </w:tc>
       </w:tr>
       <w:tr>
-        <w:tblPrEx>
-          <w:tblCellMar>
-            <w:top w:w="0" w:type="dxa"/>
-            <w:bottom w:w="0" w:type="dxa"/>
-          </w:tblCellMar>
-        </w:tblPrEx>
         <w:tc>
           <w:tcPr>
             <w:tcW w:w="1200" w:type="dxa"/>
@@ -3621,12 +3489,6 @@
         </w:tc>
       </w:tr>
       <w:tr>
-        <w:tblPrEx>
-          <w:tblCellMar>
-            <w:top w:w="0" w:type="dxa"/>
-            <w:bottom w:w="0" w:type="dxa"/>
-          </w:tblCellMar>
-        </w:tblPrEx>
         <w:tc>
           <w:tcPr>
             <w:tcW w:w="1200" w:type="dxa"/>
@@ -3724,12 +3586,6 @@
         </w:tc>
       </w:tr>
       <w:tr>
-        <w:tblPrEx>
-          <w:tblCellMar>
-            <w:top w:w="0" w:type="dxa"/>
-            <w:bottom w:w="0" w:type="dxa"/>
-          </w:tblCellMar>
-        </w:tblPrEx>
         <w:tc>
           <w:tcPr>
             <w:tcW w:w="1200" w:type="dxa"/>
@@ -3827,12 +3683,6 @@
         </w:tc>
       </w:tr>
       <w:tr>
-        <w:tblPrEx>
-          <w:tblCellMar>
-            <w:top w:w="0" w:type="dxa"/>
-            <w:bottom w:w="0" w:type="dxa"/>
-          </w:tblCellMar>
-        </w:tblPrEx>
         <w:tc>
           <w:tcPr>
             <w:tcW w:w="1200" w:type="dxa"/>
@@ -3930,12 +3780,6 @@
         </w:tc>
       </w:tr>
       <w:tr>
-        <w:tblPrEx>
-          <w:tblCellMar>
-            <w:top w:w="0" w:type="dxa"/>
-            <w:bottom w:w="0" w:type="dxa"/>
-          </w:tblCellMar>
-        </w:tblPrEx>
         <w:tc>
           <w:tcPr>
             <w:tcW w:w="1200" w:type="dxa"/>
@@ -4033,12 +3877,6 @@
         </w:tc>
       </w:tr>
       <w:tr>
-        <w:tblPrEx>
-          <w:tblCellMar>
-            <w:top w:w="0" w:type="dxa"/>
-            <w:bottom w:w="0" w:type="dxa"/>
-          </w:tblCellMar>
-        </w:tblPrEx>
         <w:tc>
           <w:tcPr>
             <w:tcW w:w="1200" w:type="dxa"/>
@@ -4136,12 +3974,6 @@
         </w:tc>
       </w:tr>
       <w:tr>
-        <w:tblPrEx>
-          <w:tblCellMar>
-            <w:top w:w="0" w:type="dxa"/>
-            <w:bottom w:w="0" w:type="dxa"/>
-          </w:tblCellMar>
-        </w:tblPrEx>
         <w:tc>
           <w:tcPr>
             <w:tcW w:w="1200" w:type="dxa"/>
@@ -4239,12 +4071,6 @@
         </w:tc>
       </w:tr>
       <w:tr>
-        <w:tblPrEx>
-          <w:tblCellMar>
-            <w:top w:w="0" w:type="dxa"/>
-            <w:bottom w:w="0" w:type="dxa"/>
-          </w:tblCellMar>
-        </w:tblPrEx>
         <w:tc>
           <w:tcPr>
             <w:tcW w:w="1200" w:type="dxa"/>
@@ -4342,12 +4168,6 @@
         </w:tc>
       </w:tr>
       <w:tr>
-        <w:tblPrEx>
-          <w:tblCellMar>
-            <w:top w:w="0" w:type="dxa"/>
-            <w:bottom w:w="0" w:type="dxa"/>
-          </w:tblCellMar>
-        </w:tblPrEx>
         <w:tc>
           <w:tcPr>
             <w:tcW w:w="1200" w:type="dxa"/>
@@ -4502,12 +4322,6 @@
         <w:gridCol w:w="1740"/>
       </w:tblGrid>
       <w:tr>
-        <w:tblPrEx>
-          <w:tblCellMar>
-            <w:top w:w="0" w:type="dxa"/>
-            <w:bottom w:w="0" w:type="dxa"/>
-          </w:tblCellMar>
-        </w:tblPrEx>
         <w:trPr>
           <w:tblHeader/>
         </w:trPr>
@@ -4625,12 +4439,6 @@
         </w:tc>
       </w:tr>
       <w:tr>
-        <w:tblPrEx>
-          <w:tblCellMar>
-            <w:top w:w="0" w:type="dxa"/>
-            <w:bottom w:w="0" w:type="dxa"/>
-          </w:tblCellMar>
-        </w:tblPrEx>
         <w:tc>
           <w:tcPr>
             <w:tcW w:w="1400" w:type="dxa"/>
@@ -4728,12 +4536,6 @@
         </w:tc>
       </w:tr>
       <w:tr>
-        <w:tblPrEx>
-          <w:tblCellMar>
-            <w:top w:w="0" w:type="dxa"/>
-            <w:bottom w:w="0" w:type="dxa"/>
-          </w:tblCellMar>
-        </w:tblPrEx>
         <w:tc>
           <w:tcPr>
             <w:tcW w:w="1400" w:type="dxa"/>
@@ -4831,12 +4633,6 @@
         </w:tc>
       </w:tr>
       <w:tr>
-        <w:tblPrEx>
-          <w:tblCellMar>
-            <w:top w:w="0" w:type="dxa"/>
-            <w:bottom w:w="0" w:type="dxa"/>
-          </w:tblCellMar>
-        </w:tblPrEx>
         <w:tc>
           <w:tcPr>
             <w:tcW w:w="1400" w:type="dxa"/>
@@ -4934,12 +4730,6 @@
         </w:tc>
       </w:tr>
       <w:tr>
-        <w:tblPrEx>
-          <w:tblCellMar>
-            <w:top w:w="0" w:type="dxa"/>
-            <w:bottom w:w="0" w:type="dxa"/>
-          </w:tblCellMar>
-        </w:tblPrEx>
         <w:tc>
           <w:tcPr>
             <w:tcW w:w="1400" w:type="dxa"/>
@@ -5037,12 +4827,6 @@
         </w:tc>
       </w:tr>
       <w:tr>
-        <w:tblPrEx>
-          <w:tblCellMar>
-            <w:top w:w="0" w:type="dxa"/>
-            <w:bottom w:w="0" w:type="dxa"/>
-          </w:tblCellMar>
-        </w:tblPrEx>
         <w:tc>
           <w:tcPr>
             <w:tcW w:w="1400" w:type="dxa"/>
@@ -5140,12 +4924,6 @@
         </w:tc>
       </w:tr>
       <w:tr>
-        <w:tblPrEx>
-          <w:tblCellMar>
-            <w:top w:w="0" w:type="dxa"/>
-            <w:bottom w:w="0" w:type="dxa"/>
-          </w:tblCellMar>
-        </w:tblPrEx>
         <w:tc>
           <w:tcPr>
             <w:tcW w:w="1400" w:type="dxa"/>
@@ -5244,12 +5022,6 @@
         </w:tc>
       </w:tr>
       <w:tr>
-        <w:tblPrEx>
-          <w:tblCellMar>
-            <w:top w:w="0" w:type="dxa"/>
-            <w:bottom w:w="0" w:type="dxa"/>
-          </w:tblCellMar>
-        </w:tblPrEx>
         <w:tc>
           <w:tcPr>
             <w:tcW w:w="1400" w:type="dxa"/>
@@ -5347,12 +5119,6 @@
         </w:tc>
       </w:tr>
       <w:tr>
-        <w:tblPrEx>
-          <w:tblCellMar>
-            <w:top w:w="0" w:type="dxa"/>
-            <w:bottom w:w="0" w:type="dxa"/>
-          </w:tblCellMar>
-        </w:tblPrEx>
         <w:tc>
           <w:tcPr>
             <w:tcW w:w="1400" w:type="dxa"/>
@@ -5450,12 +5216,6 @@
         </w:tc>
       </w:tr>
       <w:tr>
-        <w:tblPrEx>
-          <w:tblCellMar>
-            <w:top w:w="0" w:type="dxa"/>
-            <w:bottom w:w="0" w:type="dxa"/>
-          </w:tblCellMar>
-        </w:tblPrEx>
         <w:tc>
           <w:tcPr>
             <w:tcW w:w="1400" w:type="dxa"/>
@@ -5553,12 +5313,6 @@
         </w:tc>
       </w:tr>
       <w:tr>
-        <w:tblPrEx>
-          <w:tblCellMar>
-            <w:top w:w="0" w:type="dxa"/>
-            <w:bottom w:w="0" w:type="dxa"/>
-          </w:tblCellMar>
-        </w:tblPrEx>
         <w:tc>
           <w:tcPr>
             <w:tcW w:w="1400" w:type="dxa"/>
@@ -5700,7 +5454,15 @@
       </w:r>
       <w:proofErr w:type="spellEnd"/>
       <w:r>
-        <w:t xml:space="preserve">-Foam-Wash” que esta dividido en </w:t>
+        <w:t xml:space="preserve">-Foam-Wash” que </w:t>
+      </w:r>
+      <w:proofErr w:type="spellStart"/>
+      <w:r>
+        <w:t>esta</w:t>
+      </w:r>
+      <w:proofErr w:type="spellEnd"/>
+      <w:r>
+        <w:t xml:space="preserve"> dividido en </w:t>
       </w:r>
       <w:r>
         <w:t>dos Ramas:</w:t>
@@ -5888,17 +5650,7 @@
           <w:sz w:val="30"/>
           <w:szCs w:val="30"/>
         </w:rPr>
-        <w:t>1</w:t>
-      </w:r>
-      <w:r>
-        <w:rPr>
-          <w:b/>
-          <w:bCs/>
-          <w:color w:val="1F3864"/>
-          <w:sz w:val="30"/>
-          <w:szCs w:val="30"/>
-        </w:rPr>
-        <w:t>2. Cronograma de Pruebas</w:t>
+        <w:t>12. Cronograma de Pruebas</w:t>
       </w:r>
     </w:p>
     <w:p>
@@ -5933,12 +5685,6 @@
         <w:gridCol w:w="5640"/>
       </w:tblGrid>
       <w:tr>
-        <w:tblPrEx>
-          <w:tblCellMar>
-            <w:top w:w="0" w:type="dxa"/>
-            <w:bottom w:w="0" w:type="dxa"/>
-          </w:tblCellMar>
-        </w:tblPrEx>
         <w:trPr>
           <w:tblHeader/>
         </w:trPr>
@@ -6029,12 +5775,6 @@
         </w:tc>
       </w:tr>
       <w:tr>
-        <w:tblPrEx>
-          <w:tblCellMar>
-            <w:top w:w="0" w:type="dxa"/>
-            <w:bottom w:w="0" w:type="dxa"/>
-          </w:tblCellMar>
-        </w:tblPrEx>
         <w:tc>
           <w:tcPr>
             <w:tcW w:w="700" w:type="dxa"/>
@@ -6127,12 +5867,6 @@
         </w:tc>
       </w:tr>
       <w:tr>
-        <w:tblPrEx>
-          <w:tblCellMar>
-            <w:top w:w="0" w:type="dxa"/>
-            <w:bottom w:w="0" w:type="dxa"/>
-          </w:tblCellMar>
-        </w:tblPrEx>
         <w:tc>
           <w:tcPr>
             <w:tcW w:w="700" w:type="dxa"/>
@@ -6207,12 +5941,6 @@
         </w:tc>
       </w:tr>
       <w:tr>
-        <w:tblPrEx>
-          <w:tblCellMar>
-            <w:top w:w="0" w:type="dxa"/>
-            <w:bottom w:w="0" w:type="dxa"/>
-          </w:tblCellMar>
-        </w:tblPrEx>
         <w:tc>
           <w:tcPr>
             <w:tcW w:w="700" w:type="dxa"/>
@@ -6287,12 +6015,6 @@
         </w:tc>
       </w:tr>
       <w:tr>
-        <w:tblPrEx>
-          <w:tblCellMar>
-            <w:top w:w="0" w:type="dxa"/>
-            <w:bottom w:w="0" w:type="dxa"/>
-          </w:tblCellMar>
-        </w:tblPrEx>
         <w:tc>
           <w:tcPr>
             <w:tcW w:w="700" w:type="dxa"/>
@@ -6367,12 +6089,6 @@
         </w:tc>
       </w:tr>
       <w:tr>
-        <w:tblPrEx>
-          <w:tblCellMar>
-            <w:top w:w="0" w:type="dxa"/>
-            <w:bottom w:w="0" w:type="dxa"/>
-          </w:tblCellMar>
-        </w:tblPrEx>
         <w:tc>
           <w:tcPr>
             <w:tcW w:w="700" w:type="dxa"/>
@@ -6447,12 +6163,6 @@
         </w:tc>
       </w:tr>
       <w:tr>
-        <w:tblPrEx>
-          <w:tblCellMar>
-            <w:top w:w="0" w:type="dxa"/>
-            <w:bottom w:w="0" w:type="dxa"/>
-          </w:tblCellMar>
-        </w:tblPrEx>
         <w:tc>
           <w:tcPr>
             <w:tcW w:w="700" w:type="dxa"/>
@@ -6585,12 +6295,6 @@
         <w:gridCol w:w="3140"/>
       </w:tblGrid>
       <w:tr>
-        <w:tblPrEx>
-          <w:tblCellMar>
-            <w:top w:w="0" w:type="dxa"/>
-            <w:bottom w:w="0" w:type="dxa"/>
-          </w:tblCellMar>
-        </w:tblPrEx>
         <w:trPr>
           <w:tblHeader/>
         </w:trPr>
@@ -6708,12 +6412,6 @@
         </w:tc>
       </w:tr>
       <w:tr>
-        <w:tblPrEx>
-          <w:tblCellMar>
-            <w:top w:w="0" w:type="dxa"/>
-            <w:bottom w:w="0" w:type="dxa"/>
-          </w:tblCellMar>
-        </w:tblPrEx>
         <w:tc>
           <w:tcPr>
             <w:tcW w:w="3600" w:type="dxa"/>
@@ -6811,12 +6509,6 @@
         </w:tc>
       </w:tr>
       <w:tr>
-        <w:tblPrEx>
-          <w:tblCellMar>
-            <w:top w:w="0" w:type="dxa"/>
-            <w:bottom w:w="0" w:type="dxa"/>
-          </w:tblCellMar>
-        </w:tblPrEx>
         <w:tc>
           <w:tcPr>
             <w:tcW w:w="3600" w:type="dxa"/>
@@ -6914,12 +6606,6 @@
         </w:tc>
       </w:tr>
       <w:tr>
-        <w:tblPrEx>
-          <w:tblCellMar>
-            <w:top w:w="0" w:type="dxa"/>
-            <w:bottom w:w="0" w:type="dxa"/>
-          </w:tblCellMar>
-        </w:tblPrEx>
         <w:tc>
           <w:tcPr>
             <w:tcW w:w="3600" w:type="dxa"/>
@@ -7017,12 +6703,6 @@
         </w:tc>
       </w:tr>
       <w:tr>
-        <w:tblPrEx>
-          <w:tblCellMar>
-            <w:top w:w="0" w:type="dxa"/>
-            <w:bottom w:w="0" w:type="dxa"/>
-          </w:tblCellMar>
-        </w:tblPrEx>
         <w:tc>
           <w:tcPr>
             <w:tcW w:w="3600" w:type="dxa"/>
@@ -7120,12 +6800,6 @@
         </w:tc>
       </w:tr>
       <w:tr>
-        <w:tblPrEx>
-          <w:tblCellMar>
-            <w:top w:w="0" w:type="dxa"/>
-            <w:bottom w:w="0" w:type="dxa"/>
-          </w:tblCellMar>
-        </w:tblPrEx>
         <w:tc>
           <w:tcPr>
             <w:tcW w:w="3600" w:type="dxa"/>

</xml_diff>